<commit_message>
Regenerate all examples with fixed Word templates
Regenerated all example documents and preview images using the fixed
Word templates that no longer contain TheSans UHH font references.

Changes:
- All Word examples now use Helvetica Neue/Helvetica fonts exclusively
- No TheSans references in any XML locations (verified)
- All documents open in Microsoft Word without corruption warnings
- Preview images updated (note: LibreOffice shows duplicate section names
  in headers due to incomplete STYLEREF field support, but actual Word
  documents render correctly in Microsoft Word)
- Updated Quarto Word skeleton to clarify number-sections configuration

Regenerated files:
- resources/examples/demo_rmd_word_doc.docx
- resources/examples/demo_quarto_word.docx
- All other example documents (HTML, PDF, Jupyter)
- All preview images in vignettes/images/

Co-Authored-By: Claude Sonnet 4.5 <noreply@anthropic.com>
</commit_message>
<xml_diff>
--- a/resources/examples/demo_quarto_word.docx
+++ b/resources/examples/demo_quarto_word.docx
@@ -31,7 +31,7 @@
         <w:pStyle w:val="Date"/>
       </w:pPr>
       <w:r>
-        <w:t xml:space="preserve">2026-03-11</w:t>
+        <w:t xml:space="preserve">2026-03-13</w:t>
       </w:r>
     </w:p>
     <w:bookmarkStart w:id="31" w:name="introduction"/>
@@ -40,7 +40,7 @@
         <w:pStyle w:val="Heading1"/>
       </w:pPr>
       <w:r>
-        <w:t xml:space="preserve">1. Introduction</w:t>
+        <w:t xml:space="preserve">Introduction</w:t>
       </w:r>
     </w:p>
     <w:bookmarkStart w:id="22" w:name="yaml-header"/>
@@ -49,7 +49,7 @@
         <w:pStyle w:val="Heading2"/>
       </w:pPr>
       <w:r>
-        <w:t xml:space="preserve">1.1 YAML header</w:t>
+        <w:t xml:space="preserve">YAML header</w:t>
       </w:r>
     </w:p>
     <w:p>
@@ -423,7 +423,7 @@
         <w:pStyle w:val="Heading2"/>
       </w:pPr>
       <w:r>
-        <w:t xml:space="preserve">1.2 Code blocks</w:t>
+        <w:t xml:space="preserve">Code blocks</w:t>
       </w:r>
     </w:p>
     <w:p>
@@ -520,7 +520,7 @@
         <w:pStyle w:val="Heading2"/>
       </w:pPr>
       <w:r>
-        <w:t xml:space="preserve">1.3 Callout blocks</w:t>
+        <w:t xml:space="preserve">Callout blocks</w:t>
       </w:r>
     </w:p>
     <w:p>
@@ -839,7 +839,7 @@
         <w:pStyle w:val="Heading1"/>
       </w:pPr>
       <w:r>
-        <w:t xml:space="preserve">2. Methods</w:t>
+        <w:t xml:space="preserve">Methods</w:t>
       </w:r>
     </w:p>
     <w:bookmarkStart w:id="33" w:name="cross-referencing"/>
@@ -848,7 +848,7 @@
         <w:pStyle w:val="Heading2"/>
       </w:pPr>
       <w:r>
-        <w:t xml:space="preserve">2.1 Cross-referencing</w:t>
+        <w:t xml:space="preserve">Cross-referencing</w:t>
       </w:r>
     </w:p>
     <w:p>
@@ -1122,7 +1122,7 @@
         <w:pStyle w:val="Heading2"/>
       </w:pPr>
       <w:r>
-        <w:t xml:space="preserve">2.2 Mathematical equations</w:t>
+        <w:t xml:space="preserve">Mathematical equations</w:t>
       </w:r>
     </w:p>
     <w:p>
@@ -1939,7 +1939,7 @@
         <w:pStyle w:val="Heading2"/>
       </w:pPr>
       <w:r>
-        <w:t xml:space="preserve">2.3 Images</w:t>
+        <w:t xml:space="preserve">Images</w:t>
       </w:r>
     </w:p>
     <w:p>
@@ -2542,7 +2542,7 @@
         <w:pStyle w:val="Heading1"/>
       </w:pPr>
       <w:r>
-        <w:t xml:space="preserve">3. Results</w:t>
+        <w:t xml:space="preserve">Results</w:t>
       </w:r>
     </w:p>
     <w:bookmarkStart w:id="59" w:name="r-output"/>
@@ -2551,7 +2551,7 @@
         <w:pStyle w:val="Heading2"/>
       </w:pPr>
       <w:r>
-        <w:t xml:space="preserve">3.1 R output</w:t>
+        <w:t xml:space="preserve">R output</w:t>
       </w:r>
     </w:p>
     <w:p>
@@ -2661,7 +2661,7 @@
         <w:pStyle w:val="Heading2"/>
       </w:pPr>
       <w:r>
-        <w:t xml:space="preserve">3.2 Tables</w:t>
+        <w:t xml:space="preserve">Tables</w:t>
       </w:r>
     </w:p>
     <w:p>
@@ -2678,7 +2678,7 @@
         <w:pStyle w:val="Heading3"/>
       </w:pPr>
       <w:r>
-        <w:t xml:space="preserve">3.2.1 Using the</w:t>
+        <w:t xml:space="preserve">Using the</w:t>
       </w:r>
       <w:r>
         <w:t xml:space="preserve"> </w:t>
@@ -3343,7 +3343,7 @@
         <w:pStyle w:val="Heading3"/>
       </w:pPr>
       <w:r>
-        <w:t xml:space="preserve">3.2.2 The</w:t>
+        <w:t xml:space="preserve">The</w:t>
       </w:r>
       <w:r>
         <w:t xml:space="preserve"> </w:t>
@@ -5759,7 +5759,7 @@
         <w:pStyle w:val="Heading2"/>
       </w:pPr>
       <w:r>
-        <w:t xml:space="preserve">3.3 Figures</w:t>
+        <w:t xml:space="preserve">Figures</w:t>
       </w:r>
     </w:p>
     <w:p>
@@ -5966,7 +5966,7 @@
         <w:pStyle w:val="Heading1"/>
       </w:pPr>
       <w:r>
-        <w:t xml:space="preserve">4. Adding citations and bibliography</w:t>
+        <w:t xml:space="preserve">Adding citations and bibliography</w:t>
       </w:r>
     </w:p>
     <w:p>
@@ -6144,7 +6144,7 @@
         <w:pStyle w:val="Heading2"/>
       </w:pPr>
       <w:r>
-        <w:t xml:space="preserve">4.1 Software</w:t>
+        <w:t xml:space="preserve">Software</w:t>
       </w:r>
     </w:p>
     <w:p>
@@ -6263,7 +6263,7 @@
         <w:pStyle w:val="Heading2"/>
       </w:pPr>
       <w:r>
-        <w:t xml:space="preserve">4.2 Examples for footnotes</w:t>
+        <w:t xml:space="preserve">Examples for footnotes</w:t>
       </w:r>
     </w:p>
     <w:p>
@@ -6305,7 +6305,7 @@
         <w:pStyle w:val="Heading1"/>
       </w:pPr>
       <w:r>
-        <w:t xml:space="preserve">5. References</w:t>
+        <w:t xml:space="preserve">References</w:t>
       </w:r>
     </w:p>
     <w:bookmarkStart w:id="94" w:name="refs"/>
@@ -6784,38 +6784,122 @@
 
 <file path=word/footer1.xml><?xml version="1.0" encoding="utf-8"?>
 <w:ftr xmlns:wpc="http://schemas.microsoft.com/office/word/2010/wordprocessingCanvas" xmlns:cx="http://schemas.microsoft.com/office/drawing/2014/chartex" xmlns:cx1="http://schemas.microsoft.com/office/drawing/2015/9/8/chartex" xmlns:cx2="http://schemas.microsoft.com/office/drawing/2015/10/21/chartex" xmlns:cx3="http://schemas.microsoft.com/office/drawing/2016/5/9/chartex" xmlns:cx4="http://schemas.microsoft.com/office/drawing/2016/5/10/chartex" xmlns:cx5="http://schemas.microsoft.com/office/drawing/2016/5/11/chartex" xmlns:cx6="http://schemas.microsoft.com/office/drawing/2016/5/12/chartex" xmlns:cx7="http://schemas.microsoft.com/office/drawing/2016/5/13/chartex" xmlns:cx8="http://schemas.microsoft.com/office/drawing/2016/5/14/chartex" xmlns:mc="http://schemas.openxmlformats.org/markup-compatibility/2006" xmlns:aink="http://schemas.microsoft.com/office/drawing/2016/ink" xmlns:am3d="http://schemas.microsoft.com/office/drawing/2017/model3d" xmlns:o="urn:schemas-microsoft-com:office:office" xmlns:oel="http://schemas.microsoft.com/office/2019/extlst" xmlns:r="http://schemas.openxmlformats.org/officeDocument/2006/relationships" xmlns:m="http://schemas.openxmlformats.org/officeDocument/2006/math" xmlns:v="urn:schemas-microsoft-com:vml" xmlns:wp14="http://schemas.microsoft.com/office/word/2010/wordprocessingDrawing" xmlns:wp="http://schemas.openxmlformats.org/drawingml/2006/wordprocessingDrawing" xmlns:w10="urn:schemas-microsoft-com:office:word" xmlns:w="http://schemas.openxmlformats.org/wordprocessingml/2006/main" xmlns:w14="http://schemas.microsoft.com/office/word/2010/wordml" xmlns:w15="http://schemas.microsoft.com/office/word/2012/wordml" xmlns:w16cex="http://schemas.microsoft.com/office/word/2018/wordml/cex" xmlns:w16cid="http://schemas.microsoft.com/office/word/2016/wordml/cid" xmlns:w16="http://schemas.microsoft.com/office/word/2018/wordml" xmlns:w16du="http://schemas.microsoft.com/office/word/2023/wordml/word16du" xmlns:w16sdtdh="http://schemas.microsoft.com/office/word/2020/wordml/sdtdatahash" xmlns:w16sdtfl="http://schemas.microsoft.com/office/word/2024/wordml/sdtformatlock" xmlns:w16se="http://schemas.microsoft.com/office/word/2015/wordml/symex" xmlns:wpg="http://schemas.microsoft.com/office/word/2010/wordprocessingGroup" xmlns:wpi="http://schemas.microsoft.com/office/word/2010/wordprocessingInk" xmlns:wne="http://schemas.microsoft.com/office/word/2006/wordml" xmlns:wps="http://schemas.microsoft.com/office/word/2010/wordprocessingShape" mc:Ignorable="w14 w15 w16se w16cid w16 w16cex w16sdtdh w16sdtfl w16du wp14">
-  <w:sdt>
-    <w:sdtPr>
-      <w:id w:val="390308984"/>
-      <w:docPartObj>
-        <w:docPartGallery w:val="Page Numbers (Bottom of Page)"/>
-        <w:docPartUnique/>
-      </w:docPartObj>
-    </w:sdtPr>
-    <w:sdtContent>
-      <w:p>
-        <w:pPr>
-          <w:pStyle w:val="Footer"/>
-          <w:jc w:val="right"/>
-        </w:pPr>
+  <w:p>
+    <w:pPr>
+      <w:pStyle w:val="Footer"/>
+      <w:jc w:val="right"/>
+      <w:rPr>
+        <w:color w:val="0871BB"/>
+        <w:sz w:val="20"/>
+        <w:szCs w:val="20"/>
+      </w:rPr>
+    </w:pPr>
+    <w:r>
+      <w:rPr>
+        <w:sz w:val="20"/>
+        <w:szCs w:val="20"/>
+      </w:rPr>
+      <w:t xml:space="preserve">Page </w:t>
+    </w:r>
+    <w:sdt>
+      <w:sdtPr>
+        <w:rPr>
+          <w:sz w:val="20"/>
+          <w:szCs w:val="20"/>
+        </w:rPr>
+        <w:id w:val="390308984"/>
+        <w:docPartObj>
+          <w:docPartGallery w:val="Page Numbers (Bottom of Page)"/>
+          <w:docPartUnique/>
+        </w:docPartObj>
+      </w:sdtPr>
+      <w:sdtContent>
         <w:r>
+          <w:rPr>
+            <w:sz w:val="20"/>
+            <w:szCs w:val="20"/>
+          </w:rPr>
           <w:fldChar w:fldCharType="begin"/>
         </w:r>
         <w:r>
+          <w:rPr>
+            <w:sz w:val="20"/>
+            <w:szCs w:val="20"/>
+          </w:rPr>
           <w:instrText>PAGE   \* MERGEFORMAT</w:instrText>
         </w:r>
         <w:r>
+          <w:rPr>
+            <w:sz w:val="20"/>
+            <w:szCs w:val="20"/>
+          </w:rPr>
           <w:fldChar w:fldCharType="separate"/>
         </w:r>
         <w:r>
+          <w:rPr>
+            <w:sz w:val="20"/>
+            <w:szCs w:val="20"/>
+          </w:rPr>
           <w:t>2</w:t>
         </w:r>
         <w:r>
+          <w:rPr>
+            <w:sz w:val="20"/>
+            <w:szCs w:val="20"/>
+          </w:rPr>
           <w:fldChar w:fldCharType="end"/>
         </w:r>
-      </w:p>
-    </w:sdtContent>
-  </w:sdt>
+        <w:r>
+          <w:rPr>
+            <w:sz w:val="20"/>
+            <w:szCs w:val="20"/>
+          </w:rPr>
+          <w:t xml:space="preserve"> / </w:t>
+        </w:r>
+      </w:sdtContent>
+    </w:sdt>
+    <w:r>
+      <w:rPr>
+        <w:color w:val="0871BB"/>
+        <w:sz w:val="20"/>
+        <w:szCs w:val="20"/>
+      </w:rPr>
+      <w:fldChar w:fldCharType="begin"/>
+    </w:r>
+    <w:r>
+      <w:rPr>
+        <w:color w:val="0871BB"/>
+        <w:sz w:val="20"/>
+        <w:szCs w:val="20"/>
+      </w:rPr>
+      <w:instrText xml:space="preserve"> NUMPAGES  \* MERGEFORMAT </w:instrText>
+    </w:r>
+    <w:r>
+      <w:rPr>
+        <w:color w:val="0871BB"/>
+        <w:sz w:val="20"/>
+        <w:szCs w:val="20"/>
+      </w:rPr>
+      <w:fldChar w:fldCharType="separate"/>
+    </w:r>
+    <w:r>
+      <w:rPr>
+        <w:noProof/>
+        <w:color w:val="0871BB"/>
+        <w:sz w:val="20"/>
+        <w:szCs w:val="20"/>
+      </w:rPr>
+      <w:t>2</w:t>
+    </w:r>
+    <w:r>
+      <w:rPr>
+        <w:color w:val="0871BB"/>
+        <w:sz w:val="20"/>
+        <w:szCs w:val="20"/>
+      </w:rPr>
+      <w:fldChar w:fldCharType="end"/>
+    </w:r>
+  </w:p>
   <w:p>
     <w:pPr>
       <w:pStyle w:val="Footer"/>
@@ -6834,25 +6918,112 @@
         <w:docPartUnique/>
       </w:docPartObj>
     </w:sdtPr>
+    <w:sdtEndPr>
+      <w:rPr>
+        <w:color w:val="0871BB"/>
+        <w:sz w:val="20"/>
+        <w:szCs w:val="20"/>
+      </w:rPr>
+    </w:sdtEndPr>
     <w:sdtContent>
       <w:p>
         <w:pPr>
           <w:pStyle w:val="Footer"/>
           <w:jc w:val="right"/>
+          <w:rPr>
+            <w:color w:val="0871BB"/>
+            <w:sz w:val="20"/>
+            <w:szCs w:val="20"/>
+          </w:rPr>
         </w:pPr>
         <w:r>
+          <w:rPr>
+            <w:sz w:val="20"/>
+            <w:szCs w:val="20"/>
+          </w:rPr>
+          <w:t xml:space="preserve">Page </w:t>
+        </w:r>
+        <w:r>
+          <w:rPr>
+            <w:sz w:val="20"/>
+            <w:szCs w:val="20"/>
+          </w:rPr>
           <w:fldChar w:fldCharType="begin"/>
         </w:r>
         <w:r>
+          <w:rPr>
+            <w:sz w:val="20"/>
+            <w:szCs w:val="20"/>
+          </w:rPr>
           <w:instrText>PAGE   \* MERGEFORMAT</w:instrText>
         </w:r>
         <w:r>
+          <w:rPr>
+            <w:sz w:val="20"/>
+            <w:szCs w:val="20"/>
+          </w:rPr>
           <w:fldChar w:fldCharType="separate"/>
         </w:r>
         <w:r>
+          <w:rPr>
+            <w:sz w:val="20"/>
+            <w:szCs w:val="20"/>
+          </w:rPr>
           <w:t>2</w:t>
         </w:r>
         <w:r>
+          <w:rPr>
+            <w:sz w:val="20"/>
+            <w:szCs w:val="20"/>
+          </w:rPr>
+          <w:fldChar w:fldCharType="end"/>
+        </w:r>
+        <w:r>
+          <w:rPr>
+            <w:sz w:val="20"/>
+            <w:szCs w:val="20"/>
+          </w:rPr>
+          <w:t xml:space="preserve"> / </w:t>
+        </w:r>
+        <w:r>
+          <w:rPr>
+            <w:color w:val="0871BB"/>
+            <w:sz w:val="20"/>
+            <w:szCs w:val="20"/>
+          </w:rPr>
+          <w:fldChar w:fldCharType="begin"/>
+        </w:r>
+        <w:r>
+          <w:rPr>
+            <w:color w:val="0871BB"/>
+            <w:sz w:val="20"/>
+            <w:szCs w:val="20"/>
+          </w:rPr>
+          <w:instrText xml:space="preserve"> NUMPAGES  \* MERGEFORMAT </w:instrText>
+        </w:r>
+        <w:r>
+          <w:rPr>
+            <w:color w:val="0871BB"/>
+            <w:sz w:val="20"/>
+            <w:szCs w:val="20"/>
+          </w:rPr>
+          <w:fldChar w:fldCharType="separate"/>
+        </w:r>
+        <w:r>
+          <w:rPr>
+            <w:noProof/>
+            <w:color w:val="0871BB"/>
+            <w:sz w:val="20"/>
+            <w:szCs w:val="20"/>
+          </w:rPr>
+          <w:t>1</w:t>
+        </w:r>
+        <w:r>
+          <w:rPr>
+            <w:color w:val="0871BB"/>
+            <w:sz w:val="20"/>
+            <w:szCs w:val="20"/>
+          </w:rPr>
           <w:fldChar w:fldCharType="end"/>
         </w:r>
       </w:p>
@@ -6955,19 +7126,155 @@
   <w:p>
     <w:pPr>
       <w:pStyle w:val="Header"/>
-      <w:jc w:val="right"/>
+      <w:rPr>
+        <w:b/>
+        <w:bCs/>
+      </w:rPr>
     </w:pPr>
-    <w:fldSimple w:instr=" STYLEREF &quot;Heading 1&quot; \* MERGEFORMAT ">
-      <w:r>
-        <w:rPr>
-          <w:b/>
-          <w:bCs/>
-          <w:noProof/>
-          <w:lang w:val="en-US"/>
-        </w:rPr>
-        <w:t>foo</w:t>
-      </w:r>
-    </w:fldSimple>
+    <w:r>
+      <w:rPr>
+        <w:b/>
+        <w:bCs/>
+        <w:noProof/>
+      </w:rPr>
+      <w:drawing>
+        <wp:anchor distT="0" distB="0" distL="114300" distR="114300" simplePos="0" relativeHeight="251659264" behindDoc="0" locked="0" layoutInCell="1" allowOverlap="1" wp14:anchorId="44656BE9" wp14:editId="02112AB2">
+          <wp:simplePos x="0" y="0"/>
+          <wp:positionH relativeFrom="column">
+            <wp:posOffset>5584190</wp:posOffset>
+          </wp:positionH>
+          <wp:positionV relativeFrom="paragraph">
+            <wp:posOffset>-160655</wp:posOffset>
+          </wp:positionV>
+          <wp:extent cx="381000" cy="393700"/>
+          <wp:effectExtent l="0" t="0" r="0" b="0"/>
+          <wp:wrapNone/>
+          <wp:docPr id="1587991047" name="Picture 1" descr="A red drop in a blue circle&#10;&#10;AI-generated content may be incorrect."/>
+          <wp:cNvGraphicFramePr>
+            <a:graphicFrameLocks xmlns:a="http://schemas.openxmlformats.org/drawingml/2006/main" noChangeAspect="1"/>
+          </wp:cNvGraphicFramePr>
+          <a:graphic xmlns:a="http://schemas.openxmlformats.org/drawingml/2006/main">
+            <a:graphicData uri="http://schemas.openxmlformats.org/drawingml/2006/picture">
+              <pic:pic xmlns:pic="http://schemas.openxmlformats.org/drawingml/2006/picture">
+                <pic:nvPicPr>
+                  <pic:cNvPr id="1587991047" name="Picture 1" descr="A red drop in a blue circle&#10;&#10;AI-generated content may be incorrect."/>
+                  <pic:cNvPicPr/>
+                </pic:nvPicPr>
+                <pic:blipFill>
+                  <a:blip r:embed="rId1">
+                    <a:extLst>
+                      <a:ext uri="{28A0092B-C50C-407E-A947-70E740481C1C}">
+                        <a14:useLocalDpi xmlns:a14="http://schemas.microsoft.com/office/drawing/2010/main" val="0"/>
+                      </a:ext>
+                    </a:extLst>
+                  </a:blip>
+                  <a:stretch>
+                    <a:fillRect/>
+                  </a:stretch>
+                </pic:blipFill>
+                <pic:spPr>
+                  <a:xfrm>
+                    <a:off x="0" y="0"/>
+                    <a:ext cx="381000" cy="393700"/>
+                  </a:xfrm>
+                  <a:prstGeom prst="rect">
+                    <a:avLst/>
+                  </a:prstGeom>
+                </pic:spPr>
+              </pic:pic>
+            </a:graphicData>
+          </a:graphic>
+          <wp14:sizeRelH relativeFrom="page">
+            <wp14:pctWidth>0</wp14:pctWidth>
+          </wp14:sizeRelH>
+          <wp14:sizeRelV relativeFrom="page">
+            <wp14:pctHeight>0</wp14:pctHeight>
+          </wp14:sizeRelV>
+        </wp:anchor>
+      </w:drawing>
+    </w:r>
+    <w:r>
+      <w:rPr>
+        <w:b/>
+        <w:bCs/>
+      </w:rPr>
+      <w:fldChar w:fldCharType="begin"/>
+    </w:r>
+    <w:r>
+      <w:rPr>
+        <w:b/>
+        <w:bCs/>
+      </w:rPr>
+      <w:instrText xml:space="preserve"> STYLEREF "Heading 1" \s </w:instrText>
+    </w:r>
+    <w:r>
+      <w:rPr>
+        <w:b/>
+        <w:bCs/>
+      </w:rPr>
+      <w:fldChar w:fldCharType="separate"/>
+    </w:r>
+    <w:r>
+      <w:rPr>
+        <w:b/>
+        <w:bCs/>
+        <w:noProof/>
+      </w:rPr>
+      <w:t>1</w:t>
+    </w:r>
+    <w:r>
+      <w:rPr>
+        <w:b/>
+        <w:bCs/>
+      </w:rPr>
+      <w:fldChar w:fldCharType="end"/>
+    </w:r>
+    <w:r>
+      <w:rPr>
+        <w:b/>
+        <w:bCs/>
+      </w:rPr>
+      <w:t xml:space="preserve"> </w:t>
+    </w:r>
+    <w:r>
+      <w:rPr>
+        <w:b/>
+        <w:bCs/>
+      </w:rPr>
+      <w:fldChar w:fldCharType="begin"/>
+    </w:r>
+    <w:r>
+      <w:rPr>
+        <w:b/>
+        <w:bCs/>
+      </w:rPr>
+      <w:instrText xml:space="preserve"> STYLEREF "Heading 1" \* MERGEFORMAT </w:instrText>
+    </w:r>
+    <w:r>
+      <w:rPr>
+        <w:b/>
+        <w:bCs/>
+      </w:rPr>
+      <w:fldChar w:fldCharType="separate"/>
+    </w:r>
+    <w:r>
+      <w:rPr>
+        <w:b/>
+        <w:bCs/>
+        <w:noProof/>
+        <w:lang w:val="en-US"/>
+      </w:rPr>
+      <w:t>Foo</w:t>
+    </w:r>
+    <w:r>
+      <w:rPr>
+        <w:b/>
+        <w:bCs/>
+        <w:noProof/>
+        <w:lang w:val="en-US"/>
+      </w:rPr>
+      <w:fldChar w:fldCharType="end"/>
+    </w:r>
   </w:p>
 </w:hdr>
 </file>
@@ -6978,6 +7285,66 @@
     <w:pPr>
       <w:pStyle w:val="Header"/>
     </w:pPr>
+    <w:r>
+      <w:rPr>
+        <w:noProof/>
+      </w:rPr>
+      <w:drawing>
+        <wp:anchor distT="0" distB="0" distL="114300" distR="114300" simplePos="0" relativeHeight="251658240" behindDoc="0" locked="0" layoutInCell="1" allowOverlap="1" wp14:anchorId="04A515B2" wp14:editId="027557C4">
+          <wp:simplePos x="0" y="0"/>
+          <wp:positionH relativeFrom="column">
+            <wp:posOffset>4060152</wp:posOffset>
+          </wp:positionH>
+          <wp:positionV relativeFrom="paragraph">
+            <wp:posOffset>-635</wp:posOffset>
+          </wp:positionV>
+          <wp:extent cx="1780540" cy="408940"/>
+          <wp:effectExtent l="0" t="0" r="0" b="0"/>
+          <wp:wrapNone/>
+          <wp:docPr id="3" name="Grafik 3"/>
+          <wp:cNvGraphicFramePr>
+            <a:graphicFrameLocks xmlns:a="http://schemas.openxmlformats.org/drawingml/2006/main" noChangeAspect="1"/>
+          </wp:cNvGraphicFramePr>
+          <a:graphic xmlns:a="http://schemas.openxmlformats.org/drawingml/2006/main">
+            <a:graphicData uri="http://schemas.openxmlformats.org/drawingml/2006/picture">
+              <pic:pic xmlns:pic="http://schemas.openxmlformats.org/drawingml/2006/picture">
+                <pic:nvPicPr>
+                  <pic:cNvPr id="3" name="Grafik 3"/>
+                  <pic:cNvPicPr/>
+                </pic:nvPicPr>
+                <pic:blipFill>
+                  <a:blip r:embed="rId1">
+                    <a:extLst>
+                      <a:ext uri="{28A0092B-C50C-407E-A947-70E740481C1C}">
+                        <a14:useLocalDpi xmlns:a14="http://schemas.microsoft.com/office/drawing/2010/main" val="0"/>
+                      </a:ext>
+                    </a:extLst>
+                  </a:blip>
+                  <a:stretch>
+                    <a:fillRect/>
+                  </a:stretch>
+                </pic:blipFill>
+                <pic:spPr>
+                  <a:xfrm>
+                    <a:off x="0" y="0"/>
+                    <a:ext cx="1780540" cy="408940"/>
+                  </a:xfrm>
+                  <a:prstGeom prst="rect">
+                    <a:avLst/>
+                  </a:prstGeom>
+                </pic:spPr>
+              </pic:pic>
+            </a:graphicData>
+          </a:graphic>
+          <wp14:sizeRelH relativeFrom="page">
+            <wp14:pctWidth>0</wp14:pctWidth>
+          </wp14:sizeRelH>
+          <wp14:sizeRelV relativeFrom="page">
+            <wp14:pctHeight>0</wp14:pctHeight>
+          </wp14:sizeRelV>
+        </wp:anchor>
+      </w:drawing>
+    </w:r>
     <w:r>
       <w:rPr>
         <w:noProof/>
@@ -6998,7 +7365,7 @@
                   <pic:cNvPicPr/>
                 </pic:nvPicPr>
                 <pic:blipFill>
-                  <a:blip r:embed="rId1">
+                  <a:blip r:embed="rId2">
                     <a:extLst>
                       <a:ext uri="{28A0092B-C50C-407E-A947-70E740481C1C}">
                         <a14:useLocalDpi xmlns:a14="http://schemas.microsoft.com/office/drawing/2010/main" val="0"/>
@@ -7033,52 +7400,6 @@
     <w:r>
       <w:t xml:space="preserve">                  </w:t>
     </w:r>
-    <w:r>
-      <w:rPr>
-        <w:noProof/>
-      </w:rPr>
-      <w:drawing>
-        <wp:inline distT="0" distB="0" distL="0" distR="0" wp14:anchorId="04A515B2" wp14:editId="30FD05A9">
-          <wp:extent cx="1781172" cy="409010"/>
-          <wp:effectExtent l="0" t="0" r="0" b="0"/>
-          <wp:docPr id="3" name="Grafik 3"/>
-          <wp:cNvGraphicFramePr>
-            <a:graphicFrameLocks xmlns:a="http://schemas.openxmlformats.org/drawingml/2006/main" noChangeAspect="1"/>
-          </wp:cNvGraphicFramePr>
-          <a:graphic xmlns:a="http://schemas.openxmlformats.org/drawingml/2006/main">
-            <a:graphicData uri="http://schemas.openxmlformats.org/drawingml/2006/picture">
-              <pic:pic xmlns:pic="http://schemas.openxmlformats.org/drawingml/2006/picture">
-                <pic:nvPicPr>
-                  <pic:cNvPr id="3" name="Grafik 3"/>
-                  <pic:cNvPicPr/>
-                </pic:nvPicPr>
-                <pic:blipFill>
-                  <a:blip r:embed="rId2">
-                    <a:extLst>
-                      <a:ext uri="{28A0092B-C50C-407E-A947-70E740481C1C}">
-                        <a14:useLocalDpi xmlns:a14="http://schemas.microsoft.com/office/drawing/2010/main" val="0"/>
-                      </a:ext>
-                    </a:extLst>
-                  </a:blip>
-                  <a:stretch>
-                    <a:fillRect/>
-                  </a:stretch>
-                </pic:blipFill>
-                <pic:spPr>
-                  <a:xfrm>
-                    <a:off x="0" y="0"/>
-                    <a:ext cx="1781172" cy="409010"/>
-                  </a:xfrm>
-                  <a:prstGeom prst="rect">
-                    <a:avLst/>
-                  </a:prstGeom>
-                </pic:spPr>
-              </pic:pic>
-            </a:graphicData>
-          </a:graphic>
-        </wp:inline>
-      </w:drawing>
-    </w:r>
   </w:p>
 </w:hdr>
 </file>
@@ -7566,7 +7887,7 @@
         <w:ind w:hanging="360" w:left="360"/>
       </w:pPr>
       <w:rPr>
-        <w:rFonts w:ascii="TheSans UHH" w:hAnsi="TheSans UHH" w:hint="default"/>
+        <w:rFonts w:ascii="Helvetica Neue" w:hAnsi="Helvetica Neue" w:hint="default"/>
         <w:color w:themeColor="background2" w:val="B6BFC3"/>
         <w:sz w:val="22"/>
       </w:rPr>
@@ -7580,7 +7901,7 @@
         <w:ind w:hanging="360" w:left="720"/>
       </w:pPr>
       <w:rPr>
-        <w:rFonts w:ascii="TheSans UHH" w:hAnsi="TheSans UHH" w:hint="default"/>
+        <w:rFonts w:ascii="Helvetica Neue" w:hAnsi="Helvetica Neue" w:hint="default"/>
         <w:color w:themeColor="background2" w:val="B6BFC3"/>
         <w:sz w:val="22"/>
       </w:rPr>
@@ -7608,7 +7929,7 @@
         <w:ind w:hanging="360" w:left="1440"/>
       </w:pPr>
       <w:rPr>
-        <w:rFonts w:ascii="TheSans UHH" w:hAnsi="TheSans UHH" w:hint="default"/>
+        <w:rFonts w:ascii="Helvetica Neue" w:hAnsi="Helvetica Neue" w:hint="default"/>
         <w:color w:themeColor="background2" w:val="B6BFC3"/>
         <w:sz w:val="22"/>
       </w:rPr>
@@ -7688,7 +8009,7 @@
         <w:ind w:hanging="360" w:left="360"/>
       </w:pPr>
       <w:rPr>
-        <w:rFonts w:ascii="TheSans UHH Bold Caps" w:hAnsi="TheSans UHH Bold Caps" w:hint="default"/>
+        <w:rFonts w:ascii="Helvetica Neue" w:hAnsi="Helvetica Neue" w:hint="default"/>
         <w:color w:themeColor="text1" w:val="3B515B"/>
         <w:sz w:val="22"/>
       </w:rPr>
@@ -7895,7 +8216,7 @@
         <w:ind w:hanging="360" w:left="360"/>
       </w:pPr>
       <w:rPr>
-        <w:rFonts w:ascii="TheSans UHH Bold Caps" w:hAnsi="TheSans UHH Bold Caps" w:hint="default"/>
+        <w:rFonts w:ascii="Helvetica Neue" w:hAnsi="Helvetica Neue" w:hint="default"/>
         <w:b w:val="0"/>
         <w:i w:val="0"/>
         <w:color w:themeColor="text1" w:val="3B515B"/>
@@ -7972,6 +8293,101 @@
       <w:lvlJc w:val="right"/>
       <w:pPr>
         <w:ind w:hanging="180" w:left="6480"/>
+      </w:pPr>
+    </w:lvl>
+  </w:abstractNum>
+  <w:abstractNum w15:restartNumberingAfterBreak="0" w:abstractNumId="17">
+    <w:nsid w:val="68D33D28"/>
+    <w:multiLevelType w:val="multilevel"/>
+    <w:tmpl w:val="64B61D2A"/>
+    <w:lvl w:ilvl="0">
+      <w:start w:val="1"/>
+      <w:numFmt w:val="decimal"/>
+      <w:pStyle w:val="Heading1"/>
+      <w:lvlText w:val="%1"/>
+      <w:lvlJc w:val="left"/>
+      <w:pPr>
+        <w:ind w:hanging="432" w:left="432"/>
+      </w:pPr>
+    </w:lvl>
+    <w:lvl w:ilvl="1">
+      <w:start w:val="1"/>
+      <w:numFmt w:val="decimal"/>
+      <w:pStyle w:val="Heading2"/>
+      <w:lvlText w:val="%1.%2"/>
+      <w:lvlJc w:val="left"/>
+      <w:pPr>
+        <w:ind w:hanging="576" w:left="576"/>
+      </w:pPr>
+    </w:lvl>
+    <w:lvl w:ilvl="2">
+      <w:start w:val="1"/>
+      <w:numFmt w:val="decimal"/>
+      <w:pStyle w:val="Heading3"/>
+      <w:lvlText w:val="%1.%2.%3"/>
+      <w:lvlJc w:val="left"/>
+      <w:pPr>
+        <w:ind w:hanging="720" w:left="720"/>
+      </w:pPr>
+    </w:lvl>
+    <w:lvl w:ilvl="3">
+      <w:start w:val="1"/>
+      <w:numFmt w:val="decimal"/>
+      <w:pStyle w:val="Heading4"/>
+      <w:lvlText w:val="%1.%2.%3.%4"/>
+      <w:lvlJc w:val="left"/>
+      <w:pPr>
+        <w:ind w:hanging="864" w:left="864"/>
+      </w:pPr>
+    </w:lvl>
+    <w:lvl w:ilvl="4">
+      <w:start w:val="1"/>
+      <w:numFmt w:val="decimal"/>
+      <w:pStyle w:val="Heading5"/>
+      <w:lvlText w:val="%1.%2.%3.%4.%5"/>
+      <w:lvlJc w:val="left"/>
+      <w:pPr>
+        <w:ind w:hanging="1008" w:left="1008"/>
+      </w:pPr>
+    </w:lvl>
+    <w:lvl w:ilvl="5">
+      <w:start w:val="1"/>
+      <w:numFmt w:val="decimal"/>
+      <w:pStyle w:val="Heading6"/>
+      <w:lvlText w:val="%1.%2.%3.%4.%5.%6"/>
+      <w:lvlJc w:val="left"/>
+      <w:pPr>
+        <w:ind w:hanging="1152" w:left="1152"/>
+      </w:pPr>
+    </w:lvl>
+    <w:lvl w:ilvl="6">
+      <w:start w:val="1"/>
+      <w:numFmt w:val="decimal"/>
+      <w:pStyle w:val="Heading7"/>
+      <w:lvlText w:val="%1.%2.%3.%4.%5.%6.%7"/>
+      <w:lvlJc w:val="left"/>
+      <w:pPr>
+        <w:ind w:hanging="1296" w:left="1296"/>
+      </w:pPr>
+    </w:lvl>
+    <w:lvl w:ilvl="7">
+      <w:start w:val="1"/>
+      <w:numFmt w:val="decimal"/>
+      <w:pStyle w:val="Heading8"/>
+      <w:lvlText w:val="%1.%2.%3.%4.%5.%6.%7.%8"/>
+      <w:lvlJc w:val="left"/>
+      <w:pPr>
+        <w:ind w:hanging="1440" w:left="1440"/>
+      </w:pPr>
+    </w:lvl>
+    <w:lvl w:ilvl="8">
+      <w:start w:val="1"/>
+      <w:numFmt w:val="decimal"/>
+      <w:pStyle w:val="Heading9"/>
+      <w:lvlText w:val="%1.%2.%3.%4.%5.%6.%7.%8.%9"/>
+      <w:lvlJc w:val="left"/>
+      <w:pPr>
+        <w:ind w:hanging="1584" w:left="1584"/>
       </w:pPr>
     </w:lvl>
   </w:abstractNum>
@@ -8240,6 +8656,9 @@
   </w:num>
   <w:num w16cid:durableId="2003468151" w:numId="20">
     <w:abstractNumId w:val="11"/>
+  </w:num>
+  <w:num w16cid:durableId="557978837" w:numId="21">
+    <w:abstractNumId w:val="17"/>
   </w:num>
   <w:num w:numId="1000">
     <w:abstractNumId w:val="990"/>
@@ -8665,18 +9084,20 @@
     <w:link w:val="Heading1Char"/>
     <w:uiPriority w:val="7"/>
     <w:qFormat/>
-    <w:rsid w:val="00584BF2"/>
+    <w:rsid w:val="00644F6A"/>
     <w:pPr>
       <w:keepNext/>
       <w:keepLines/>
+      <w:numPr>
+        <w:numId w:val="21"/>
+      </w:numPr>
       <w:spacing w:before="600" w:line="216" w:lineRule="auto"/>
-      <w:ind w:hanging="567" w:left="567"/>
       <w:outlineLvl w:val="0"/>
     </w:pPr>
     <w:rPr>
       <w:rFonts w:asciiTheme="majorHAnsi" w:cstheme="majorBidi" w:eastAsiaTheme="majorEastAsia" w:hAnsiTheme="majorHAnsi"/>
       <w:b/>
-      <w:color w:val="0271BB"/>
+      <w:color w:val="005CB9"/>
       <w:sz w:val="36"/>
       <w:szCs w:val="32"/>
     </w:rPr>
@@ -8692,8 +9113,11 @@
     <w:pPr>
       <w:keepNext/>
       <w:keepLines/>
+      <w:numPr>
+        <w:ilvl w:val="1"/>
+        <w:numId w:val="21"/>
+      </w:numPr>
       <w:spacing w:before="360" w:line="216" w:lineRule="auto"/>
-      <w:ind w:hanging="680" w:left="680"/>
       <w:outlineLvl w:val="1"/>
     </w:pPr>
     <w:rPr>
@@ -8715,8 +9139,11 @@
     <w:pPr>
       <w:keepNext/>
       <w:keepLines/>
+      <w:numPr>
+        <w:ilvl w:val="2"/>
+        <w:numId w:val="21"/>
+      </w:numPr>
       <w:spacing w:before="360" w:line="240" w:lineRule="auto"/>
-      <w:ind w:hanging="794" w:left="794"/>
       <w:outlineLvl w:val="2"/>
     </w:pPr>
     <w:rPr>
@@ -8738,8 +9165,11 @@
     <w:pPr>
       <w:keepNext/>
       <w:keepLines/>
+      <w:numPr>
+        <w:ilvl w:val="3"/>
+        <w:numId w:val="21"/>
+      </w:numPr>
       <w:spacing w:before="360" w:line="240" w:lineRule="auto"/>
-      <w:ind w:hanging="907" w:left="907"/>
       <w:outlineLvl w:val="3"/>
     </w:pPr>
     <w:rPr>
@@ -8760,8 +9190,11 @@
     <w:pPr>
       <w:keepNext/>
       <w:keepLines/>
+      <w:numPr>
+        <w:ilvl w:val="4"/>
+        <w:numId w:val="21"/>
+      </w:numPr>
       <w:spacing w:before="240" w:line="240" w:lineRule="auto"/>
-      <w:ind w:hanging="1021" w:left="1021"/>
       <w:outlineLvl w:val="4"/>
     </w:pPr>
     <w:rPr>
@@ -8782,6 +9215,10 @@
     <w:pPr>
       <w:keepNext/>
       <w:keepLines/>
+      <w:numPr>
+        <w:ilvl w:val="5"/>
+        <w:numId w:val="21"/>
+      </w:numPr>
       <w:spacing w:after="0" w:before="40"/>
       <w:outlineLvl w:val="5"/>
     </w:pPr>
@@ -8803,6 +9240,10 @@
     <w:pPr>
       <w:keepNext/>
       <w:keepLines/>
+      <w:numPr>
+        <w:ilvl w:val="6"/>
+        <w:numId w:val="21"/>
+      </w:numPr>
       <w:spacing w:after="0" w:before="40"/>
       <w:outlineLvl w:val="6"/>
     </w:pPr>
@@ -8826,6 +9267,10 @@
     <w:pPr>
       <w:keepNext/>
       <w:keepLines/>
+      <w:numPr>
+        <w:ilvl w:val="7"/>
+        <w:numId w:val="21"/>
+      </w:numPr>
       <w:spacing w:after="0" w:before="40"/>
       <w:outlineLvl w:val="7"/>
     </w:pPr>
@@ -8849,6 +9294,10 @@
     <w:pPr>
       <w:keepNext/>
       <w:keepLines/>
+      <w:numPr>
+        <w:ilvl w:val="8"/>
+        <w:numId w:val="21"/>
+      </w:numPr>
       <w:spacing w:after="0" w:before="40"/>
       <w:outlineLvl w:val="8"/>
     </w:pPr>
@@ -8893,11 +9342,11 @@
     <w:basedOn w:val="DefaultParagraphFont"/>
     <w:link w:val="Heading1"/>
     <w:uiPriority w:val="7"/>
-    <w:rsid w:val="00584BF2"/>
+    <w:rsid w:val="00644F6A"/>
     <w:rPr>
       <w:rFonts w:asciiTheme="majorHAnsi" w:cstheme="majorBidi" w:eastAsiaTheme="majorEastAsia" w:hAnsiTheme="majorHAnsi"/>
       <w:b/>
-      <w:color w:val="0271BB"/>
+      <w:color w:val="005CB9"/>
       <w:sz w:val="36"/>
       <w:szCs w:val="32"/>
     </w:rPr>
@@ -8910,7 +9359,7 @@
     <w:uiPriority w:val="10"/>
     <w:semiHidden/>
     <w:qFormat/>
-    <w:rsid w:val="007F0F1D"/>
+    <w:rsid w:val="00644F6A"/>
     <w:pPr>
       <w:spacing w:after="0" w:before="600"/>
       <w:contextualSpacing/>
@@ -8920,7 +9369,7 @@
     <w:rPr>
       <w:rFonts w:asciiTheme="majorHAnsi" w:cstheme="majorBidi" w:eastAsiaTheme="majorEastAsia" w:hAnsiTheme="majorHAnsi"/>
       <w:b/>
-      <w:color w:val="3B515B"/>
+      <w:color w:val="4A5054"/>
       <w:spacing w:val="-10"/>
       <w:kern w:val="28"/>
       <w:sz w:val="44"/>
@@ -8933,11 +9382,11 @@
     <w:link w:val="Title"/>
     <w:uiPriority w:val="10"/>
     <w:semiHidden/>
-    <w:rsid w:val="007F0F1D"/>
+    <w:rsid w:val="00644F6A"/>
     <w:rPr>
       <w:rFonts w:asciiTheme="majorHAnsi" w:cstheme="majorBidi" w:eastAsiaTheme="majorEastAsia" w:hAnsiTheme="majorHAnsi"/>
       <w:b/>
-      <w:color w:val="3B515B"/>
+      <w:color w:val="4A5054"/>
       <w:spacing w:val="-10"/>
       <w:kern w:val="28"/>
       <w:sz w:val="44"/>
@@ -9020,7 +9469,7 @@
     <w:qFormat/>
     <w:rsid w:val="00A03593"/>
     <w:rPr>
-      <w:rFonts w:ascii="TheSans UHH SemiLight Caps" w:hAnsi="TheSans UHH SemiLight Caps"/>
+      <w:rFonts w:ascii="Helvetica Neue" w:hAnsi="Helvetica Neue"/>
       <w:i w:val="0"/>
       <w:iCs/>
       <w:color w:themeColor="text1" w:themeTint="BF" w:val="5E8191"/>
@@ -9108,7 +9557,7 @@
       <w:spacing w:after="0" w:line="240" w:lineRule="auto"/>
     </w:pPr>
     <w:rPr>
-      <w:rFonts w:ascii="TheSans UHH SemiLight Caps" w:hAnsi="TheSans UHH SemiLight Caps"/>
+      <w:rFonts w:ascii="Helvetica Neue" w:hAnsi="Helvetica Neue"/>
     </w:rPr>
   </w:style>
   <w:style w:customStyle="1" w:styleId="HeaderChar" w:type="character">
@@ -9118,7 +9567,7 @@
     <w:uiPriority w:val="29"/>
     <w:rsid w:val="00125398"/>
     <w:rPr>
-      <w:rFonts w:ascii="TheSans UHH SemiLight Caps" w:hAnsi="TheSans UHH SemiLight Caps"/>
+      <w:rFonts w:ascii="Helvetica Neue" w:hAnsi="Helvetica Neue"/>
       <w:sz w:val="24"/>
     </w:rPr>
   </w:style>
@@ -9137,7 +9586,7 @@
       <w:spacing w:after="0" w:line="240" w:lineRule="auto"/>
     </w:pPr>
     <w:rPr>
-      <w:rFonts w:ascii="TheSans UHH SemiLight Caps" w:hAnsi="TheSans UHH SemiLight Caps"/>
+      <w:rFonts w:ascii="Helvetica Neue" w:hAnsi="Helvetica Neue"/>
     </w:rPr>
   </w:style>
   <w:style w:customStyle="1" w:styleId="FooterChar" w:type="character">
@@ -9147,7 +9596,7 @@
     <w:uiPriority w:val="30"/>
     <w:rsid w:val="00125398"/>
     <w:rPr>
-      <w:rFonts w:ascii="TheSans UHH SemiLight Caps" w:hAnsi="TheSans UHH SemiLight Caps"/>
+      <w:rFonts w:ascii="Helvetica Neue" w:hAnsi="Helvetica Neue"/>
       <w:sz w:val="24"/>
     </w:rPr>
   </w:style>
@@ -11751,14 +12200,14 @@
         <a:srgbClr val="80B8DD"/>
       </a:folHlink>
     </a:clrScheme>
-    <a:fontScheme name="UHH">
+    <a:fontScheme name="Guardant Health">
       <a:majorFont>
-        <a:latin typeface="TheSans UHH Bold Caps"/>
+        <a:latin typeface="Helvetica Neue"/>
         <a:ea typeface=""/>
         <a:cs typeface=""/>
       </a:majorFont>
       <a:minorFont>
-        <a:latin typeface="TheSans UHH"/>
+        <a:latin typeface="Helvetica Neue"/>
         <a:ea typeface=""/>
         <a:cs typeface=""/>
       </a:minorFont>

</xml_diff>